<commit_message>
Updated app code for deployment
</commit_message>
<xml_diff>
--- a/PAIMANA-AI_Jury_Explainer.docx
+++ b/PAIMANA-AI_Jury_Explainer.docx
@@ -2092,7 +2092,7 @@
         <w:pStyle w:val="ListBullet"/>
       </w:pPr>
       <w:r>
-        <w:t>cost_revision_to_date_pct — average impact score 0.081</w:t>
+        <w:t>cost_revision_to_date_pct — average impact score 0.082</w:t>
       </w:r>
     </w:p>
     <w:p>
@@ -2108,7 +2108,7 @@
         <w:pStyle w:val="ListBullet"/>
       </w:pPr>
       <w:r>
-        <w:t>doc_slip_to_date_m — average impact score 0.050</w:t>
+        <w:t>doc_slip_to_date_m — average impact score 0.049</w:t>
       </w:r>
     </w:p>
     <w:p>

</xml_diff>